<commit_message>
ci: add dev/prod workflows, update ports & seed for E2E
- docker-compose: FRONTEND_PORT/BACKEND_PORT env vars (dev:3096/3095, prod:3097/3098)
- seed: add E2E test client (client.e2e@test.cm / Client@1234)
- playwright.config: CI mode, configurable baseURL
- .github/workflows/dev.yml: unit + integration + E2E + deploy dev
- .github/workflows/prod.yml: promote dev->prod->main + deploy prod

Co-Authored-By: Claude Sonnet 4.6 <noreply@anthropic.com>
</commit_message>
<xml_diff>
--- a/Doc-INTIA/RSD-INTIA.docx
+++ b/Doc-INTIA/RSD-INTIA.docx
@@ -3459,6 +3459,64 @@
           <w:szCs w:val="20"/>
         </w:rPr>
       </w:pPr>
+      <w:r>
+        <w:rPr>
+          <w:rFonts w:ascii="Times New Roman" w:hAnsi="Times New Roman" w:cs="Times New Roman"/>
+          <w:color w:val="1A1A2E"/>
+          <w:sz w:val="20"/>
+          <w:szCs w:val="20"/>
+          <w:lang w:val="fr-CM"/>
+        </w:rPr>
+        <w:drawing>
+          <wp:anchor distT="0" distB="0" distL="114300" distR="114300" simplePos="0" relativeHeight="251661824" behindDoc="0" locked="0" layoutInCell="1" allowOverlap="1" wp14:anchorId="1B1CAA13" wp14:editId="6583BBA6">
+            <wp:simplePos x="0" y="0"/>
+            <wp:positionH relativeFrom="column">
+              <wp:posOffset>-320675</wp:posOffset>
+            </wp:positionH>
+            <wp:positionV relativeFrom="paragraph">
+              <wp:posOffset>249555</wp:posOffset>
+            </wp:positionV>
+            <wp:extent cx="7011560" cy="1954530"/>
+            <wp:effectExtent l="0" t="0" r="0" b="7620"/>
+            <wp:wrapNone/>
+            <wp:docPr id="1" name="Image 1"/>
+            <wp:cNvGraphicFramePr>
+              <a:graphicFrameLocks xmlns:a="http://schemas.openxmlformats.org/drawingml/2006/main" noChangeAspect="1"/>
+            </wp:cNvGraphicFramePr>
+            <a:graphic xmlns:a="http://schemas.openxmlformats.org/drawingml/2006/main">
+              <a:graphicData uri="http://schemas.openxmlformats.org/drawingml/2006/picture">
+                <pic:pic xmlns:pic="http://schemas.openxmlformats.org/drawingml/2006/picture">
+                  <pic:nvPicPr>
+                    <pic:cNvPr id="1" name=""/>
+                    <pic:cNvPicPr/>
+                  </pic:nvPicPr>
+                  <pic:blipFill>
+                    <a:blip r:embed="rId8"/>
+                    <a:stretch>
+                      <a:fillRect/>
+                    </a:stretch>
+                  </pic:blipFill>
+                  <pic:spPr>
+                    <a:xfrm>
+                      <a:off x="0" y="0"/>
+                      <a:ext cx="7011560" cy="1954530"/>
+                    </a:xfrm>
+                    <a:prstGeom prst="rect">
+                      <a:avLst/>
+                    </a:prstGeom>
+                  </pic:spPr>
+                </pic:pic>
+              </a:graphicData>
+            </a:graphic>
+            <wp14:sizeRelH relativeFrom="margin">
+              <wp14:pctWidth>0</wp14:pctWidth>
+            </wp14:sizeRelH>
+            <wp14:sizeRelV relativeFrom="margin">
+              <wp14:pctHeight>0</wp14:pctHeight>
+            </wp14:sizeRelV>
+          </wp:anchor>
+        </w:drawing>
+      </w:r>
     </w:p>
     <w:p>
       <w:pPr>
@@ -3525,10 +3583,49 @@
     </w:p>
     <w:p>
       <w:pPr>
+        <w:jc w:val="center"/>
         <w:rPr>
           <w:rFonts w:ascii="Times New Roman" w:hAnsi="Times New Roman" w:cs="Times New Roman"/>
           <w:sz w:val="20"/>
           <w:szCs w:val="20"/>
+          <w:lang w:val="fr-CM"/>
+        </w:rPr>
+      </w:pPr>
+      <w:r>
+        <w:rPr>
+          <w:rFonts w:ascii="Times New Roman" w:hAnsi="Times New Roman" w:cs="Times New Roman"/>
+          <w:sz w:val="20"/>
+          <w:szCs w:val="20"/>
+          <w:lang w:val="fr-CM"/>
+        </w:rPr>
+        <w:t xml:space="preserve">Fig1. </w:t>
+      </w:r>
+      <w:r>
+        <w:rPr>
+          <w:rFonts w:ascii="Times New Roman" w:hAnsi="Times New Roman" w:cs="Times New Roman"/>
+          <w:sz w:val="20"/>
+          <w:szCs w:val="20"/>
+          <w:lang w:val="fr-CM"/>
+        </w:rPr>
+        <w:t>Architecture système globale de I</w:t>
+      </w:r>
+      <w:r>
+        <w:rPr>
+          <w:rFonts w:ascii="Times New Roman" w:hAnsi="Times New Roman" w:cs="Times New Roman"/>
+          <w:sz w:val="20"/>
+          <w:szCs w:val="20"/>
+          <w:lang w:val="fr-CM"/>
+        </w:rPr>
+        <w:t>NTIA Assurances</w:t>
+      </w:r>
+    </w:p>
+    <w:p>
+      <w:pPr>
+        <w:rPr>
+          <w:rFonts w:ascii="Times New Roman" w:hAnsi="Times New Roman" w:cs="Times New Roman"/>
+          <w:sz w:val="20"/>
+          <w:szCs w:val="20"/>
+          <w:lang w:val="fr-CM"/>
         </w:rPr>
       </w:pPr>
     </w:p>
@@ -3538,24 +3635,7 @@
           <w:rFonts w:ascii="Times New Roman" w:hAnsi="Times New Roman" w:cs="Times New Roman"/>
           <w:sz w:val="20"/>
           <w:szCs w:val="20"/>
-        </w:rPr>
-      </w:pPr>
-    </w:p>
-    <w:p>
-      <w:pPr>
-        <w:rPr>
-          <w:rFonts w:ascii="Times New Roman" w:hAnsi="Times New Roman" w:cs="Times New Roman"/>
-          <w:sz w:val="20"/>
-          <w:szCs w:val="20"/>
-        </w:rPr>
-      </w:pPr>
-    </w:p>
-    <w:p>
-      <w:pPr>
-        <w:rPr>
-          <w:rFonts w:ascii="Times New Roman" w:hAnsi="Times New Roman" w:cs="Times New Roman"/>
-          <w:sz w:val="20"/>
-          <w:szCs w:val="20"/>
+          <w:lang w:val="fr-CM"/>
         </w:rPr>
       </w:pPr>
     </w:p>
@@ -6499,6 +6579,7 @@
       </w:pPr>
     </w:p>
     <w:sectPr>
+      <w:footerReference w:type="default" r:id="rId9"/>
       <w:pgSz w:w="12240" w:h="15840"/>
       <w:pgMar w:top="1417" w:right="1417" w:bottom="1417" w:left="1417" w:header="720" w:footer="720" w:gutter="0"/>
       <w:cols w:space="720"/>
@@ -6506,6 +6587,101 @@
     </w:sectPr>
   </w:body>
 </w:document>
+</file>
+
+<file path=word/endnotes.xml><?xml version="1.0" encoding="utf-8"?>
+<w:endnotes xmlns:wpc="http://schemas.microsoft.com/office/word/2010/wordprocessingCanvas" xmlns:cx="http://schemas.microsoft.com/office/drawing/2014/chartex" xmlns:cx1="http://schemas.microsoft.com/office/drawing/2015/9/8/chartex" xmlns:cx2="http://schemas.microsoft.com/office/drawing/2015/10/21/chartex" xmlns:cx3="http://schemas.microsoft.com/office/drawing/2016/5/9/chartex" xmlns:cx4="http://schemas.microsoft.com/office/drawing/2016/5/10/chartex" xmlns:cx5="http://schemas.microsoft.com/office/drawing/2016/5/11/chartex" xmlns:cx6="http://schemas.microsoft.com/office/drawing/2016/5/12/chartex" xmlns:cx7="http://schemas.microsoft.com/office/drawing/2016/5/13/chartex" xmlns:cx8="http://schemas.microsoft.com/office/drawing/2016/5/14/chartex" xmlns:mc="http://schemas.openxmlformats.org/markup-compatibility/2006" xmlns:aink="http://schemas.microsoft.com/office/drawing/2016/ink" xmlns:am3d="http://schemas.microsoft.com/office/drawing/2017/model3d" xmlns:o="urn:schemas-microsoft-com:office:office" xmlns:r="http://schemas.openxmlformats.org/officeDocument/2006/relationships" xmlns:m="http://schemas.openxmlformats.org/officeDocument/2006/math" xmlns:v="urn:schemas-microsoft-com:vml" xmlns:wp14="http://schemas.microsoft.com/office/word/2010/wordprocessingDrawing" xmlns:wp="http://schemas.openxmlformats.org/drawingml/2006/wordprocessingDrawing" xmlns:w10="urn:schemas-microsoft-com:office:word" xmlns:w="http://schemas.openxmlformats.org/wordprocessingml/2006/main" xmlns:w14="http://schemas.microsoft.com/office/word/2010/wordml" xmlns:w15="http://schemas.microsoft.com/office/word/2012/wordml" xmlns:w16cex="http://schemas.microsoft.com/office/word/2018/wordml/cex" xmlns:w16cid="http://schemas.microsoft.com/office/word/2016/wordml/cid" xmlns:w16="http://schemas.microsoft.com/office/word/2018/wordml" xmlns:w16sdtdh="http://schemas.microsoft.com/office/word/2020/wordml/sdtdatahash" xmlns:w16se="http://schemas.microsoft.com/office/word/2015/wordml/symex" xmlns:wpg="http://schemas.microsoft.com/office/word/2010/wordprocessingGroup" xmlns:wpi="http://schemas.microsoft.com/office/word/2010/wordprocessingInk" xmlns:wne="http://schemas.microsoft.com/office/word/2006/wordml" xmlns:wps="http://schemas.microsoft.com/office/word/2010/wordprocessingShape" mc:Ignorable="w14 w15 w16se w16cid w16 w16cex w16sdtdh wp14">
+  <w:endnote w:type="separator" w:id="-1">
+    <w:p>
+      <w:pPr>
+        <w:spacing w:after="0" w:line="240" w:lineRule="auto"/>
+      </w:pPr>
+      <w:r>
+        <w:separator/>
+      </w:r>
+    </w:p>
+  </w:endnote>
+  <w:endnote w:type="continuationSeparator" w:id="0">
+    <w:p>
+      <w:pPr>
+        <w:spacing w:after="0" w:line="240" w:lineRule="auto"/>
+      </w:pPr>
+      <w:r>
+        <w:continuationSeparator/>
+      </w:r>
+    </w:p>
+  </w:endnote>
+</w:endnotes>
+</file>
+
+<file path=word/footer1.xml><?xml version="1.0" encoding="utf-8"?>
+<w:ftr xmlns:wpc="http://schemas.microsoft.com/office/word/2010/wordprocessingCanvas" xmlns:cx="http://schemas.microsoft.com/office/drawing/2014/chartex" xmlns:cx1="http://schemas.microsoft.com/office/drawing/2015/9/8/chartex" xmlns:cx2="http://schemas.microsoft.com/office/drawing/2015/10/21/chartex" xmlns:cx3="http://schemas.microsoft.com/office/drawing/2016/5/9/chartex" xmlns:cx4="http://schemas.microsoft.com/office/drawing/2016/5/10/chartex" xmlns:cx5="http://schemas.microsoft.com/office/drawing/2016/5/11/chartex" xmlns:cx6="http://schemas.microsoft.com/office/drawing/2016/5/12/chartex" xmlns:cx7="http://schemas.microsoft.com/office/drawing/2016/5/13/chartex" xmlns:cx8="http://schemas.microsoft.com/office/drawing/2016/5/14/chartex" xmlns:mc="http://schemas.openxmlformats.org/markup-compatibility/2006" xmlns:aink="http://schemas.microsoft.com/office/drawing/2016/ink" xmlns:am3d="http://schemas.microsoft.com/office/drawing/2017/model3d" xmlns:o="urn:schemas-microsoft-com:office:office" xmlns:r="http://schemas.openxmlformats.org/officeDocument/2006/relationships" xmlns:m="http://schemas.openxmlformats.org/officeDocument/2006/math" xmlns:v="urn:schemas-microsoft-com:vml" xmlns:wp14="http://schemas.microsoft.com/office/word/2010/wordprocessingDrawing" xmlns:wp="http://schemas.openxmlformats.org/drawingml/2006/wordprocessingDrawing" xmlns:w10="urn:schemas-microsoft-com:office:word" xmlns:w="http://schemas.openxmlformats.org/wordprocessingml/2006/main" xmlns:w14="http://schemas.microsoft.com/office/word/2010/wordml" xmlns:w15="http://schemas.microsoft.com/office/word/2012/wordml" xmlns:w16cex="http://schemas.microsoft.com/office/word/2018/wordml/cex" xmlns:w16cid="http://schemas.microsoft.com/office/word/2016/wordml/cid" xmlns:w16="http://schemas.microsoft.com/office/word/2018/wordml" xmlns:w16sdtdh="http://schemas.microsoft.com/office/word/2020/wordml/sdtdatahash" xmlns:w16se="http://schemas.microsoft.com/office/word/2015/wordml/symex" xmlns:wpg="http://schemas.microsoft.com/office/word/2010/wordprocessingGroup" xmlns:wpi="http://schemas.microsoft.com/office/word/2010/wordprocessingInk" xmlns:wne="http://schemas.microsoft.com/office/word/2006/wordml" xmlns:wps="http://schemas.microsoft.com/office/word/2010/wordprocessingShape" mc:Ignorable="w14 w15 w16se w16cid w16 w16cex w16sdtdh wp14">
+  <w:sdt>
+    <w:sdtPr>
+      <w:id w:val="-1075741911"/>
+      <w:docPartObj>
+        <w:docPartGallery w:val="Page Numbers (Bottom of Page)"/>
+        <w:docPartUnique/>
+      </w:docPartObj>
+    </w:sdtPr>
+    <w:sdtContent>
+      <w:p>
+        <w:pPr>
+          <w:pStyle w:val="Pieddepage"/>
+          <w:jc w:val="right"/>
+        </w:pPr>
+        <w:r>
+          <w:fldChar w:fldCharType="begin"/>
+        </w:r>
+        <w:r>
+          <w:instrText>PAGE   \* MERGEFORMAT</w:instrText>
+        </w:r>
+        <w:r>
+          <w:fldChar w:fldCharType="separate"/>
+        </w:r>
+        <w:r>
+          <w:rPr>
+            <w:lang w:val="fr-FR"/>
+          </w:rPr>
+          <w:t>2</w:t>
+        </w:r>
+        <w:r>
+          <w:fldChar w:fldCharType="end"/>
+        </w:r>
+      </w:p>
+    </w:sdtContent>
+  </w:sdt>
+  <w:p>
+    <w:pPr>
+      <w:pStyle w:val="Pieddepage"/>
+    </w:pPr>
+  </w:p>
+</w:ftr>
+</file>
+
+<file path=word/footnotes.xml><?xml version="1.0" encoding="utf-8"?>
+<w:footnotes xmlns:wpc="http://schemas.microsoft.com/office/word/2010/wordprocessingCanvas" xmlns:cx="http://schemas.microsoft.com/office/drawing/2014/chartex" xmlns:cx1="http://schemas.microsoft.com/office/drawing/2015/9/8/chartex" xmlns:cx2="http://schemas.microsoft.com/office/drawing/2015/10/21/chartex" xmlns:cx3="http://schemas.microsoft.com/office/drawing/2016/5/9/chartex" xmlns:cx4="http://schemas.microsoft.com/office/drawing/2016/5/10/chartex" xmlns:cx5="http://schemas.microsoft.com/office/drawing/2016/5/11/chartex" xmlns:cx6="http://schemas.microsoft.com/office/drawing/2016/5/12/chartex" xmlns:cx7="http://schemas.microsoft.com/office/drawing/2016/5/13/chartex" xmlns:cx8="http://schemas.microsoft.com/office/drawing/2016/5/14/chartex" xmlns:mc="http://schemas.openxmlformats.org/markup-compatibility/2006" xmlns:aink="http://schemas.microsoft.com/office/drawing/2016/ink" xmlns:am3d="http://schemas.microsoft.com/office/drawing/2017/model3d" xmlns:o="urn:schemas-microsoft-com:office:office" xmlns:r="http://schemas.openxmlformats.org/officeDocument/2006/relationships" xmlns:m="http://schemas.openxmlformats.org/officeDocument/2006/math" xmlns:v="urn:schemas-microsoft-com:vml" xmlns:wp14="http://schemas.microsoft.com/office/word/2010/wordprocessingDrawing" xmlns:wp="http://schemas.openxmlformats.org/drawingml/2006/wordprocessingDrawing" xmlns:w10="urn:schemas-microsoft-com:office:word" xmlns:w="http://schemas.openxmlformats.org/wordprocessingml/2006/main" xmlns:w14="http://schemas.microsoft.com/office/word/2010/wordml" xmlns:w15="http://schemas.microsoft.com/office/word/2012/wordml" xmlns:w16cex="http://schemas.microsoft.com/office/word/2018/wordml/cex" xmlns:w16cid="http://schemas.microsoft.com/office/word/2016/wordml/cid" xmlns:w16="http://schemas.microsoft.com/office/word/2018/wordml" xmlns:w16sdtdh="http://schemas.microsoft.com/office/word/2020/wordml/sdtdatahash" xmlns:w16se="http://schemas.microsoft.com/office/word/2015/wordml/symex" xmlns:wpg="http://schemas.microsoft.com/office/word/2010/wordprocessingGroup" xmlns:wpi="http://schemas.microsoft.com/office/word/2010/wordprocessingInk" xmlns:wne="http://schemas.microsoft.com/office/word/2006/wordml" xmlns:wps="http://schemas.microsoft.com/office/word/2010/wordprocessingShape" mc:Ignorable="w14 w15 w16se w16cid w16 w16cex w16sdtdh wp14">
+  <w:footnote w:type="separator" w:id="-1">
+    <w:p>
+      <w:pPr>
+        <w:spacing w:after="0" w:line="240" w:lineRule="auto"/>
+      </w:pPr>
+      <w:r>
+        <w:separator/>
+      </w:r>
+    </w:p>
+  </w:footnote>
+  <w:footnote w:type="continuationSeparator" w:id="0">
+    <w:p>
+      <w:pPr>
+        <w:spacing w:after="0" w:line="240" w:lineRule="auto"/>
+      </w:pPr>
+      <w:r>
+        <w:continuationSeparator/>
+      </w:r>
+    </w:p>
+  </w:footnote>
+</w:footnotes>
 </file>
 
 <file path=word/numbering.xml><?xml version="1.0" encoding="utf-8"?>

</xml_diff>